<commit_message>
added intake specialist agent to ai build
</commit_message>
<xml_diff>
--- a/Khushboo_Dodani_Resume_MidiHealth.docx
+++ b/Khushboo_Dodani_Resume_MidiHealth.docx
@@ -5,7 +5,6 @@
   <w:body>
     <w:p>
       <w:pPr>
-        <w:spacing w:after="40"/>
         <w:jc w:val="center"/>
       </w:pPr>
       <w:r>
@@ -19,7 +18,6 @@
     </w:p>
     <w:p>
       <w:pPr>
-        <w:spacing w:after="40"/>
         <w:jc w:val="center"/>
       </w:pPr>
       <w:r>
@@ -29,21 +27,15 @@
         </w:rPr>
         <w:t xml:space="preserve">San Francisco Bay Area  |  khushdodani@gmail.com  |  </w:t>
       </w:r>
-      <w:hyperlink r:id="rId6" w:history="1">
+      <w:hyperlink r:id="rId6">
         <w:r>
           <w:rPr>
-            <w:rStyle w:val="Hyperlink"/>
-            <w:color w:val="6D28D9"/>
+            <w:color w:val="78716C"/>
             <w:sz w:val="18"/>
+            <w:szCs w:val="18"/>
+            <w:u w:val="single"/>
           </w:rPr>
           <w:t>LinkedIn</w:t>
-        </w:r>
-        <w:r>
-          <w:rPr>
-            <w:rStyle w:val="Hyperlink"/>
-            <w:sz w:val="18"/>
-          </w:rPr>
-          <w:t xml:space="preserve"> </w:t>
         </w:r>
       </w:hyperlink>
       <w:r>
@@ -51,38 +43,33 @@
           <w:color w:val="78716C"/>
           <w:sz w:val="18"/>
         </w:rPr>
-        <w:t xml:space="preserve"> |  </w:t>
+        <w:t xml:space="preserve">  |  </w:t>
       </w:r>
-      <w:hyperlink r:id="rId7" w:history="1">
+      <w:hyperlink r:id="rId7">
         <w:r>
           <w:rPr>
-            <w:rStyle w:val="Hyperlink"/>
-            <w:color w:val="6D28D9"/>
+            <w:color w:val="78716C"/>
             <w:sz w:val="18"/>
+            <w:szCs w:val="18"/>
+            <w:u w:val="single"/>
           </w:rPr>
-          <w:t xml:space="preserve">GitHub </w:t>
+          <w:t>GitHub</w:t>
         </w:r>
       </w:hyperlink>
-      <w:r>
-        <w:rPr>
-          <w:color w:val="6D28D9"/>
-          <w:sz w:val="18"/>
-        </w:rPr>
-        <w:t xml:space="preserve"> </w:t>
-      </w:r>
       <w:r>
         <w:rPr>
           <w:color w:val="78716C"/>
           <w:sz w:val="18"/>
         </w:rPr>
-        <w:t xml:space="preserve">|  </w:t>
+        <w:t xml:space="preserve">  |  </w:t>
       </w:r>
-      <w:hyperlink r:id="rId8" w:history="1">
+      <w:hyperlink r:id="rId8">
         <w:r>
           <w:rPr>
-            <w:rStyle w:val="Hyperlink"/>
-            <w:color w:val="6D28D9"/>
+            <w:color w:val="78716C"/>
             <w:sz w:val="18"/>
+            <w:szCs w:val="18"/>
+            <w:u w:val="single"/>
           </w:rPr>
           <w:t>Portfolio</w:t>
         </w:r>
@@ -90,32 +77,21 @@
     </w:p>
     <w:p>
       <w:pPr>
-        <w:spacing w:before="40" w:after="40"/>
-        <w:jc w:val="center"/>
-        <w:rPr>
-          <w:b/>
-          <w:color w:val="6D28D9"/>
-          <w:sz w:val="24"/>
-        </w:rPr>
-      </w:pPr>
-    </w:p>
-    <w:p>
-      <w:pPr>
-        <w:spacing w:before="40" w:after="40"/>
+        <w:spacing w:before="20"/>
         <w:jc w:val="center"/>
       </w:pPr>
       <w:r>
         <w:rPr>
           <w:b/>
           <w:color w:val="6D28D9"/>
-          <w:sz w:val="24"/>
+          <w:sz w:val="23"/>
         </w:rPr>
-        <w:t>PRODUCT MANAGER</w:t>
+        <w:t>PRODUCT MANAGER  —  PATIENT EXPERIENCE, ENGAGEMENT &amp; GROWTH</w:t>
       </w:r>
     </w:p>
     <w:p>
       <w:pPr>
-        <w:spacing w:before="20" w:after="80"/>
+        <w:spacing w:after="20"/>
         <w:jc w:val="center"/>
       </w:pPr>
       <w:r>
@@ -123,32 +99,66 @@
           <w:color w:val="5B21B6"/>
           <w:sz w:val="18"/>
         </w:rPr>
-        <w:t>Care Delivery Systems  •  EHR &amp; Clinical Workflows  •  Clinician Experience  •  AI-enabled Operations</w:t>
+        <w:t>Patient Journeys  •  Adoption &amp; Trust  •  Retention &amp; Segmentation  •  Clinical Partnership</w:t>
       </w:r>
     </w:p>
     <w:p>
       <w:pPr>
-        <w:spacing w:before="80" w:after="80"/>
+        <w:spacing w:after="20"/>
+        <w:jc w:val="center"/>
+        <w:rPr>
+          <w:sz w:val="18"/>
+          <w:szCs w:val="18"/>
+        </w:rPr>
+      </w:pPr>
+    </w:p>
+    <w:p>
+      <w:pPr>
+        <w:spacing w:before="40" w:after="40"/>
+        <w:rPr>
+          <w:sz w:val="18"/>
+          <w:szCs w:val="18"/>
+          <w:lang w:val="en-CA"/>
+        </w:rPr>
       </w:pPr>
       <w:r>
         <w:rPr>
-          <w:color w:val="44403C"/>
-          <w:sz w:val="19"/>
+          <w:sz w:val="18"/>
+          <w:szCs w:val="18"/>
+          <w:lang w:val="en-CA"/>
         </w:rPr>
-        <w:t>Product Manager with 4+ years building care delivery systems, EHR-adjacent clinical workflows, and AI-enabled operations for healthcare platforms. Experienced partnering with engineers, clinicians, and clinical operations teams to reduce administrative friction, automate manual processes, and help clinicians focus on patients — in regulated healthcare environments where reliability, compliance, and trust are non-negotiable. Track record taking complex workflow challenges from discovery through measurable improvement with cross-functional teams.</w:t>
+        <w:t xml:space="preserve">Product Manager with </w:t>
+      </w:r>
+      <w:r>
+        <w:rPr>
+          <w:sz w:val="18"/>
+          <w:szCs w:val="18"/>
+          <w:lang w:val="en-CA"/>
+        </w:rPr>
+        <w:t>5</w:t>
+      </w:r>
+      <w:r>
+        <w:rPr>
+          <w:sz w:val="18"/>
+          <w:szCs w:val="18"/>
+          <w:lang w:val="en-CA"/>
+        </w:rPr>
+        <w:t>+ years of product management experience across healthcare platforms, digital user journeys, and data-driven engagement. Combines user research, funnel analytics, behavioral segmentation, and cross-functional execution to reduce friction, improve adoption, and inform retention strategies. At WorkSafeBC, reduced a healthcare submission journey from 11 steps to 5, contributed to approximately 60% digital adoption within six months, and reduced support calls by 30%. At Technical Safety BC, developed retention analytics and targeted RFM outreach that generated 78% more collections than the existing call strategy in a same-period comparison.</w:t>
       </w:r>
     </w:p>
     <w:p>
       <w:pPr>
+        <w:keepNext/>
         <w:pBdr>
           <w:bottom w:val="single" w:sz="6" w:space="1" w:color="6D28D9"/>
         </w:pBdr>
-        <w:spacing w:before="40" w:after="40"/>
+        <w:spacing w:before="20" w:after="20"/>
       </w:pPr>
     </w:p>
     <w:p>
       <w:pPr>
-        <w:spacing w:before="160" w:after="40"/>
+        <w:keepNext/>
+        <w:spacing w:before="40"/>
       </w:pPr>
       <w:r>
         <w:rPr>
@@ -161,19 +171,41 @@
     </w:p>
     <w:p>
       <w:pPr>
-        <w:spacing w:before="100" w:after="20"/>
+        <w:keepNext/>
+        <w:spacing w:before="60"/>
       </w:pPr>
       <w:r>
         <w:rPr>
           <w:b/>
-          <w:color w:val="1C1917"/>
-          <w:sz w:val="20"/>
+          <w:sz w:val="21"/>
         </w:rPr>
-        <w:t>Product Manager — Provider &amp; Clinician Experience  |  WorkSafeBC</w:t>
+        <w:t xml:space="preserve">Product Manager — </w:t>
       </w:r>
       <w:r>
         <w:rPr>
-          <w:color w:val="78716C"/>
+          <w:b/>
+          <w:sz w:val="21"/>
+        </w:rPr>
+        <w:t>Provider &amp; Clinician Experience</w:t>
+      </w:r>
+      <w:r>
+        <w:rPr>
+          <w:b/>
+          <w:sz w:val="21"/>
+        </w:rPr>
+        <w:t xml:space="preserve">  |  </w:t>
+      </w:r>
+      <w:proofErr w:type="spellStart"/>
+      <w:r>
+        <w:rPr>
+          <w:b/>
+          <w:sz w:val="21"/>
+        </w:rPr>
+        <w:t>WorkSafeBC</w:t>
+      </w:r>
+      <w:proofErr w:type="spellEnd"/>
+      <w:r>
+        <w:rPr>
           <w:sz w:val="18"/>
         </w:rPr>
         <w:t xml:space="preserve">    Apr 2024 – Present</w:t>
@@ -181,297 +213,250 @@
     </w:p>
     <w:p>
       <w:pPr>
-        <w:spacing w:after="20"/>
-      </w:pPr>
+        <w:keepNext/>
+        <w:numPr>
+          <w:ilvl w:val="0"/>
+          <w:numId w:val="10"/>
+        </w:numPr>
+        <w:spacing w:before="60"/>
+        <w:rPr>
+          <w:iCs/>
+          <w:sz w:val="18"/>
+          <w:lang w:val="en-CA"/>
+        </w:rPr>
+      </w:pPr>
+      <w:r>
+        <w:rPr>
+          <w:iCs/>
+          <w:color w:val="6D28D9"/>
+          <w:sz w:val="18"/>
+          <w:lang w:val="en-CA"/>
+        </w:rPr>
+        <w:t xml:space="preserve">Journey optimization: </w:t>
+      </w:r>
+      <w:r>
+        <w:rPr>
+          <w:iCs/>
+          <w:sz w:val="18"/>
+          <w:lang w:val="en-CA"/>
+        </w:rPr>
+        <w:t>Redesigned a logged-in healthcare submission journey from 11 steps to 5, reducing support calls by 30% and increasing NPS by 25 points.</w:t>
+      </w:r>
+    </w:p>
+    <w:p>
+      <w:pPr>
+        <w:keepNext/>
+        <w:numPr>
+          <w:ilvl w:val="0"/>
+          <w:numId w:val="10"/>
+        </w:numPr>
+        <w:spacing w:before="60"/>
+        <w:rPr>
+          <w:iCs/>
+          <w:sz w:val="18"/>
+          <w:lang w:val="en-CA"/>
+        </w:rPr>
+      </w:pPr>
+      <w:r>
+        <w:rPr>
+          <w:iCs/>
+          <w:color w:val="6D28D9"/>
+          <w:sz w:val="18"/>
+          <w:lang w:val="en-CA"/>
+        </w:rPr>
+        <w:t xml:space="preserve">Adoption and funnel analysis: </w:t>
+      </w:r>
+      <w:r>
+        <w:rPr>
+          <w:iCs/>
+          <w:sz w:val="18"/>
+          <w:lang w:val="en-CA"/>
+        </w:rPr>
+        <w:t xml:space="preserve">Instrumented </w:t>
+      </w:r>
+      <w:proofErr w:type="spellStart"/>
+      <w:r>
+        <w:rPr>
+          <w:iCs/>
+          <w:sz w:val="18"/>
+          <w:lang w:val="en-CA"/>
+        </w:rPr>
+        <w:t>PostHog</w:t>
+      </w:r>
+      <w:proofErr w:type="spellEnd"/>
+      <w:r>
+        <w:rPr>
+          <w:iCs/>
+          <w:sz w:val="18"/>
+          <w:lang w:val="en-CA"/>
+        </w:rPr>
+        <w:t xml:space="preserve"> conversion, drop-off, and segment metrics; identified a discoverability issue with the duplicate-line control when early adoption stalled and improved the existing flow rather than expanding scope.</w:t>
+      </w:r>
+    </w:p>
+    <w:p>
+      <w:pPr>
+        <w:keepNext/>
+        <w:numPr>
+          <w:ilvl w:val="0"/>
+          <w:numId w:val="10"/>
+        </w:numPr>
+        <w:spacing w:before="60"/>
+        <w:rPr>
+          <w:iCs/>
+          <w:sz w:val="18"/>
+          <w:lang w:val="en-CA"/>
+        </w:rPr>
+      </w:pPr>
+      <w:r>
+        <w:rPr>
+          <w:iCs/>
+          <w:color w:val="6D28D9"/>
+          <w:sz w:val="18"/>
+          <w:lang w:val="en-CA"/>
+        </w:rPr>
+        <w:t xml:space="preserve">Behavioral segmentation: </w:t>
+      </w:r>
+      <w:r>
+        <w:rPr>
+          <w:iCs/>
+          <w:sz w:val="18"/>
+          <w:lang w:val="en-CA"/>
+        </w:rPr>
+        <w:t>Analyzed paper-submission patterns across 3,795 provider organizations; identified 25 organizations responsible for approximately half of remaining paper submissions and prioritized the roadmap around this high-impact cohort.</w:t>
+      </w:r>
+    </w:p>
+    <w:p>
+      <w:pPr>
+        <w:keepNext/>
+        <w:numPr>
+          <w:ilvl w:val="0"/>
+          <w:numId w:val="10"/>
+        </w:numPr>
+        <w:spacing w:before="60"/>
+        <w:rPr>
+          <w:iCs/>
+          <w:sz w:val="18"/>
+          <w:lang w:val="en-CA"/>
+        </w:rPr>
+      </w:pPr>
+      <w:r>
+        <w:rPr>
+          <w:iCs/>
+          <w:color w:val="6D28D9"/>
+          <w:sz w:val="18"/>
+          <w:lang w:val="en-CA"/>
+        </w:rPr>
+        <w:t xml:space="preserve">Lifecycle communications and onboarding: </w:t>
+      </w:r>
+      <w:r>
+        <w:rPr>
+          <w:iCs/>
+          <w:sz w:val="18"/>
+          <w:lang w:val="en-CA"/>
+        </w:rPr>
+        <w:t>Coordinated in-product banners, administrator emails, and a phased rollout to migrate 5,600 clinicians across 500 organizations while maintaining access to critical healthcare systems.</w:t>
+      </w:r>
+    </w:p>
+    <w:p>
+      <w:pPr>
+        <w:keepNext/>
+        <w:numPr>
+          <w:ilvl w:val="0"/>
+          <w:numId w:val="10"/>
+        </w:numPr>
+        <w:spacing w:before="60"/>
+        <w:rPr>
+          <w:iCs/>
+          <w:sz w:val="18"/>
+          <w:lang w:val="en-CA"/>
+        </w:rPr>
+      </w:pPr>
+      <w:r>
+        <w:rPr>
+          <w:iCs/>
+          <w:color w:val="6D28D9"/>
+          <w:sz w:val="18"/>
+          <w:lang w:val="en-CA"/>
+        </w:rPr>
+        <w:t xml:space="preserve">Care continuation: </w:t>
+      </w:r>
+      <w:r>
+        <w:rPr>
+          <w:iCs/>
+          <w:sz w:val="18"/>
+          <w:lang w:val="en-CA"/>
+        </w:rPr>
+        <w:t>Analyzed 139K historical treatment-continuation requests in an $80M physiotherapy program; retained clinical review while introducing request tracking, decision rationale, and email notifications to make next steps more visible.</w:t>
+      </w:r>
+    </w:p>
+    <w:p>
+      <w:pPr>
+        <w:keepNext/>
+        <w:numPr>
+          <w:ilvl w:val="0"/>
+          <w:numId w:val="10"/>
+        </w:numPr>
+        <w:spacing w:before="60"/>
+        <w:rPr>
+          <w:i/>
+          <w:sz w:val="18"/>
+          <w:lang w:val="en-CA"/>
+        </w:rPr>
+      </w:pPr>
+      <w:r>
+        <w:rPr>
+          <w:iCs/>
+          <w:color w:val="6D28D9"/>
+          <w:sz w:val="18"/>
+          <w:lang w:val="en-CA"/>
+        </w:rPr>
+        <w:t xml:space="preserve">Platform strategy: </w:t>
+      </w:r>
+      <w:r>
+        <w:rPr>
+          <w:iCs/>
+          <w:sz w:val="18"/>
+          <w:lang w:val="en-CA"/>
+        </w:rPr>
+        <w:t>Secured $80K in executive funding for API-enabled EHR/EMR integrations, defining a roadmap to expand digital connectivity across approximately 70% of the provider ecosystem</w:t>
+      </w:r>
       <w:r>
         <w:rPr>
           <w:i/>
-          <w:color w:val="4F46E5"/>
           <w:sz w:val="18"/>
+          <w:lang w:val="en-CA"/>
         </w:rPr>
-        <w:t>Care Delivery Systems</w:t>
+        <w:t>.</w:t>
       </w:r>
     </w:p>
     <w:p>
       <w:pPr>
-        <w:pStyle w:val="ListBullet"/>
-        <w:spacing w:before="20" w:after="20"/>
-        <w:ind w:left="576" w:hanging="288"/>
-      </w:pPr>
-      <w:r>
-        <w:rPr>
-          <w:color w:val="44403C"/>
-          <w:sz w:val="19"/>
-        </w:rPr>
-        <w:t>Own product strategy for digital systems supporting healthcare providers and clinicians submitting treatment requests, referrals, and invoices through WorkSafeBC's clinical portal.</w:t>
-      </w:r>
-    </w:p>
-    <w:p>
-      <w:pPr>
-        <w:pStyle w:val="ListBullet"/>
-        <w:spacing w:before="20" w:after="20"/>
-        <w:ind w:left="576" w:hanging="288"/>
-      </w:pPr>
-      <w:r>
-        <w:rPr>
-          <w:color w:val="44403C"/>
-          <w:sz w:val="19"/>
-        </w:rPr>
-        <w:t>Partner with clinicians, clinical operations, engineering, architects, and executive leadership to improve the care delivery infrastructure supporting providers across British Columbia.</w:t>
-      </w:r>
-    </w:p>
-    <w:p>
-      <w:pPr>
-        <w:pStyle w:val="ListBullet"/>
-        <w:spacing w:before="20" w:after="20"/>
-        <w:ind w:left="576" w:hanging="288"/>
-        <w:rPr>
-          <w:color w:val="44403C"/>
-          <w:sz w:val="19"/>
-          <w:szCs w:val="19"/>
-        </w:rPr>
-      </w:pPr>
-      <w:r>
-        <w:rPr>
-          <w:color w:val="44403C"/>
-          <w:sz w:val="19"/>
-          <w:szCs w:val="19"/>
-        </w:rPr>
-        <w:t>Conducted interviews, workflow observations, and usability research with clinicians to identify friction and prioritize roadmap investments.</w:t>
-      </w:r>
-    </w:p>
-    <w:p>
-      <w:pPr>
-        <w:spacing w:after="20"/>
-      </w:pPr>
-      <w:r>
-        <w:rPr>
-          <w:i/>
-          <w:color w:val="4F46E5"/>
-          <w:sz w:val="18"/>
-        </w:rPr>
-        <w:t>Clinical Workflow Infrastructure &amp; EHR-Adjacent Systems</w:t>
-      </w:r>
-    </w:p>
-    <w:p>
-      <w:pPr>
-        <w:pStyle w:val="ListBullet"/>
-        <w:spacing w:before="20" w:after="20"/>
-        <w:ind w:left="576" w:hanging="288"/>
-      </w:pPr>
-      <w:r>
-        <w:rPr>
-          <w:color w:val="44403C"/>
-          <w:sz w:val="19"/>
-        </w:rPr>
-        <w:t>Led redesign of clinician-facing workflows after interviews, usability studies, analytics, and journey mapping identified major friction in the clinical documentation and invoicing process.</w:t>
-      </w:r>
-    </w:p>
-    <w:p>
-      <w:pPr>
-        <w:pStyle w:val="ListBullet"/>
-        <w:spacing w:before="20" w:after="20"/>
-        <w:ind w:left="576" w:hanging="288"/>
-      </w:pPr>
-      <w:r>
-        <w:rPr>
-          <w:color w:val="44403C"/>
-          <w:sz w:val="19"/>
-        </w:rPr>
-        <w:t>Reduced submission journey from 11 steps to 5, cutting clinician administrative burden and increasing digital adoption to 60% within six months — generating approximately $200K in annual operational savings.</w:t>
-      </w:r>
-    </w:p>
-    <w:p>
-      <w:pPr>
-        <w:pStyle w:val="ListBullet"/>
-        <w:spacing w:before="20" w:after="20"/>
-        <w:ind w:left="576" w:hanging="288"/>
-      </w:pPr>
-      <w:r>
-        <w:rPr>
-          <w:color w:val="44403C"/>
-          <w:sz w:val="19"/>
-        </w:rPr>
-        <w:t>Improved data quality through front-end validation and simplified workflows, decreasing support calls by 30% while increasing clinician satisfaction (NPS +25).</w:t>
-      </w:r>
-    </w:p>
-    <w:p>
-      <w:pPr>
-        <w:pStyle w:val="ListBullet"/>
-        <w:spacing w:before="20" w:after="20"/>
-        <w:ind w:left="576" w:hanging="288"/>
-      </w:pPr>
-      <w:r>
-        <w:rPr>
-          <w:color w:val="44403C"/>
-          <w:sz w:val="19"/>
-        </w:rPr>
-        <w:t>Established adoption metrics using PostHog and continuously prioritized improvements using clinician feedback and behavioral analytics.</w:t>
-      </w:r>
-    </w:p>
-    <w:p>
-      <w:pPr>
-        <w:spacing w:after="20"/>
-      </w:pPr>
-      <w:r>
-        <w:rPr>
-          <w:i/>
-          <w:color w:val="4F46E5"/>
-          <w:sz w:val="18"/>
-        </w:rPr>
-        <w:t>Healthcare Interoperability &amp; EHR Platform Strategy</w:t>
-      </w:r>
-    </w:p>
-    <w:p>
-      <w:pPr>
-        <w:pStyle w:val="ListBullet"/>
-        <w:spacing w:before="20" w:after="20"/>
-        <w:ind w:left="576" w:hanging="288"/>
-      </w:pPr>
-      <w:r>
-        <w:rPr>
-          <w:color w:val="44403C"/>
-          <w:sz w:val="19"/>
-        </w:rPr>
-        <w:t>Led product discovery for a healthcare interoperability platform enabling direct submission of clinical documentation from EHR/EMR systems — including OSCAR — directly into WorkSafeBC, reducing documentation burden on clinicians and informing long-term platform strategy.</w:t>
-      </w:r>
-    </w:p>
-    <w:p>
-      <w:pPr>
-        <w:pStyle w:val="ListBullet"/>
-        <w:spacing w:before="20" w:after="20"/>
-        <w:ind w:left="576" w:hanging="288"/>
-      </w:pPr>
-      <w:r>
-        <w:rPr>
-          <w:color w:val="44403C"/>
-          <w:sz w:val="19"/>
-        </w:rPr>
-        <w:t>Secured $80K in executive funding to expand provider connectivity through API-enabled integrations with the province's largest EHR vendors, establishing a roadmap covering approximately 70% of the provider ecosystem.</w:t>
-      </w:r>
-    </w:p>
-    <w:p>
-      <w:pPr>
-        <w:pStyle w:val="ListBullet"/>
-        <w:spacing w:before="20" w:after="20"/>
-        <w:ind w:left="576" w:hanging="288"/>
-      </w:pPr>
-      <w:r>
-        <w:rPr>
-          <w:color w:val="44403C"/>
-          <w:sz w:val="19"/>
-        </w:rPr>
-        <w:t>Evaluated clinician workflows, EHR integration constraints, and technical tradeoffs to prioritize scalable interoperability capabilities across external healthcare systems.</w:t>
-      </w:r>
-    </w:p>
-    <w:p>
-      <w:pPr>
-        <w:spacing w:after="20"/>
-      </w:pPr>
-      <w:r>
-        <w:rPr>
-          <w:i/>
-          <w:color w:val="4F46E5"/>
-          <w:sz w:val="18"/>
-        </w:rPr>
-        <w:t>Internal Systems &amp; Clinical Access Infrastructure</w:t>
-      </w:r>
-    </w:p>
-    <w:p>
-      <w:pPr>
-        <w:pStyle w:val="ListBullet"/>
-        <w:spacing w:before="20" w:after="20"/>
-        <w:ind w:left="576" w:hanging="288"/>
-      </w:pPr>
-      <w:r>
-        <w:rPr>
-          <w:color w:val="44403C"/>
-          <w:sz w:val="19"/>
-        </w:rPr>
-        <w:t>Led migration from a legacy government identity platform to a modern CIAM solution supporting secure access to referral and claims systems for 5,600 healthcare providers across 500+ organizations.</w:t>
-      </w:r>
-    </w:p>
-    <w:p>
-      <w:pPr>
-        <w:pStyle w:val="ListBullet"/>
-        <w:spacing w:before="20" w:after="20"/>
-        <w:ind w:left="576" w:hanging="288"/>
-      </w:pPr>
-      <w:r>
-        <w:rPr>
-          <w:color w:val="44403C"/>
-          <w:sz w:val="19"/>
-        </w:rPr>
-        <w:t>Delivered migration with 0% downtime, 85% provider migration before deadline, and 92% post-launch login success — ensuring uninterrupted clinician access to critical care delivery systems.</w:t>
-      </w:r>
-    </w:p>
-    <w:p>
-      <w:pPr>
-        <w:pStyle w:val="ListBullet"/>
-        <w:spacing w:before="20" w:after="20"/>
-        <w:ind w:left="576" w:hanging="288"/>
-      </w:pPr>
-      <w:r>
-        <w:rPr>
-          <w:color w:val="44403C"/>
-          <w:sz w:val="19"/>
-        </w:rPr>
-        <w:t>Coordinated Engineering, Operations, Communications, and external partners across rollout, provider onboarding, adoption, and change management.</w:t>
-      </w:r>
-    </w:p>
-    <w:p>
-      <w:pPr>
-        <w:spacing w:after="20"/>
-      </w:pPr>
-      <w:r>
-        <w:rPr>
-          <w:i/>
-          <w:color w:val="4F46E5"/>
-          <w:sz w:val="18"/>
-        </w:rPr>
-        <w:t>AI-enabled Clinical Operations</w:t>
-      </w:r>
-    </w:p>
-    <w:p>
-      <w:pPr>
-        <w:pStyle w:val="ListBullet"/>
-        <w:spacing w:before="20" w:after="20"/>
-        <w:ind w:left="576" w:hanging="288"/>
-      </w:pPr>
-      <w:r>
-        <w:rPr>
-          <w:color w:val="44403C"/>
-          <w:sz w:val="19"/>
-        </w:rPr>
-        <w:t>Led development of Referral Radar, an AI-assisted clinical decision support prototype using LLM agents, knowledge visualization, and intelligent task routing to recommend healthcare program referrals — demonstrating potential to reduce claim costs by approximately $20M.</w:t>
-      </w:r>
-    </w:p>
-    <w:p>
-      <w:pPr>
-        <w:pStyle w:val="ListBullet"/>
-        <w:spacing w:before="20" w:after="20"/>
-        <w:ind w:left="576" w:hanging="288"/>
-      </w:pPr>
-      <w:r>
-        <w:rPr>
-          <w:color w:val="44403C"/>
-          <w:sz w:val="19"/>
-        </w:rPr>
-        <w:lastRenderedPageBreak/>
-        <w:t>Leveraged AI-enabled prototyping tools including Lovable and GitHub Copilot to accelerate clinical product discovery, user validation, and engineering collaboration, reducing concept-to-validation timelines by approximately 40%.</w:t>
-      </w:r>
-    </w:p>
-    <w:p>
-      <w:pPr>
-        <w:spacing w:before="100" w:after="20"/>
+        <w:keepNext/>
+        <w:spacing w:before="60"/>
       </w:pPr>
       <w:r>
         <w:rPr>
           <w:b/>
           <w:color w:val="1C1917"/>
-          <w:sz w:val="20"/>
+          <w:sz w:val="21"/>
         </w:rPr>
-        <w:t>Product Manager  |  Technical Safety BC</w:t>
+        <w:t xml:space="preserve">Product Manager (promoted from </w:t>
+      </w:r>
+      <w:r>
+        <w:rPr>
+          <w:b/>
+          <w:color w:val="1C1917"/>
+          <w:sz w:val="21"/>
+        </w:rPr>
+        <w:t>Product</w:t>
+      </w:r>
+      <w:r>
+        <w:rPr>
+          <w:b/>
+          <w:color w:val="1C1917"/>
+          <w:sz w:val="21"/>
+        </w:rPr>
+        <w:t xml:space="preserve"> Analyst)  |  Technical Safety BC</w:t>
       </w:r>
       <w:r>
         <w:rPr>
@@ -483,83 +468,110 @@
     </w:p>
     <w:p>
       <w:pPr>
-        <w:pStyle w:val="ListBullet"/>
-        <w:spacing w:before="20" w:after="20"/>
-        <w:ind w:left="576" w:hanging="288"/>
+        <w:keepNext/>
+        <w:numPr>
+          <w:ilvl w:val="0"/>
+          <w:numId w:val="11"/>
+        </w:numPr>
+        <w:spacing w:before="60"/>
+        <w:rPr>
+          <w:iCs/>
+          <w:sz w:val="18"/>
+          <w:lang w:val="en-CA"/>
+        </w:rPr>
       </w:pPr>
       <w:r>
         <w:rPr>
-          <w:color w:val="44403C"/>
-          <w:sz w:val="19"/>
+          <w:iCs/>
+          <w:color w:val="6D28D9"/>
+          <w:sz w:val="18"/>
+          <w:lang w:val="en-CA"/>
         </w:rPr>
-        <w:t>Led discovery for a mobile remote inspections platform through contextual user research, workflow mapping, usability testing, rapid prototyping, and experimentation before development investment.</w:t>
+        <w:t xml:space="preserve">Retention analytics: </w:t>
+      </w:r>
+      <w:r>
+        <w:rPr>
+          <w:iCs/>
+          <w:sz w:val="18"/>
+          <w:lang w:val="en-CA"/>
+        </w:rPr>
+        <w:t>Built an operating-permit view covering approximately 102,000 active permits, quantifying net churn, preventable churn, and permit lifetime value by industry and work class.</w:t>
       </w:r>
     </w:p>
     <w:p>
       <w:pPr>
-        <w:pStyle w:val="ListBullet"/>
-        <w:spacing w:before="20" w:after="20"/>
-        <w:ind w:left="576" w:hanging="288"/>
+        <w:keepNext/>
+        <w:numPr>
+          <w:ilvl w:val="0"/>
+          <w:numId w:val="11"/>
+        </w:numPr>
+        <w:spacing w:before="60"/>
+        <w:rPr>
+          <w:iCs/>
+          <w:sz w:val="18"/>
+          <w:lang w:val="en-CA"/>
+        </w:rPr>
       </w:pPr>
       <w:r>
         <w:rPr>
-          <w:color w:val="44403C"/>
-          <w:sz w:val="19"/>
+          <w:iCs/>
+          <w:color w:val="6D28D9"/>
+          <w:sz w:val="18"/>
+          <w:lang w:val="en-CA"/>
         </w:rPr>
-        <w:t>Partnered with engineering, field inspectors, designers, and operations leaders to translate operational pain points into product requirements, roadmap priorities, and implementation plans.</w:t>
+        <w:t xml:space="preserve">Targeted engagement: </w:t>
+      </w:r>
+      <w:r>
+        <w:rPr>
+          <w:iCs/>
+          <w:sz w:val="18"/>
+          <w:lang w:val="en-CA"/>
+        </w:rPr>
+        <w:t>Compared RFM-segmented outreach with the existing call strategy over the same two-week period, with measures defined in advance; the RFM group generated $45,742 in collections versus $25,597 for the existing strategy (approximately 79% higher).</w:t>
       </w:r>
     </w:p>
     <w:p>
       <w:pPr>
-        <w:pStyle w:val="ListBullet"/>
-        <w:spacing w:before="20" w:after="20"/>
-        <w:ind w:left="576" w:hanging="288"/>
+        <w:keepNext/>
+        <w:numPr>
+          <w:ilvl w:val="0"/>
+          <w:numId w:val="11"/>
+        </w:numPr>
+        <w:spacing w:before="60"/>
+        <w:rPr>
+          <w:iCs/>
+          <w:sz w:val="18"/>
+          <w:lang w:val="en-CA"/>
+        </w:rPr>
       </w:pPr>
       <w:r>
         <w:rPr>
-          <w:color w:val="44403C"/>
-          <w:sz w:val="19"/>
+          <w:iCs/>
+          <w:color w:val="6D28D9"/>
+          <w:sz w:val="18"/>
+          <w:lang w:val="en-CA"/>
         </w:rPr>
-        <w:t>Built NLP-powered email classification to automate routing and triage of incoming operational requests, reducing manual inbox processing burden — direct predecessor to AI-assisted workflow tooling.</w:t>
+        <w:t xml:space="preserve">Reactivation: </w:t>
+      </w:r>
+      <w:r>
+        <w:rPr>
+          <w:iCs/>
+          <w:sz w:val="18"/>
+          <w:lang w:val="en-CA"/>
+        </w:rPr>
+        <w:t>Designed a multi-step email sequence for expired permits; 23% paid following the initial email, based on the campaign's reported results.</w:t>
       </w:r>
     </w:p>
     <w:p>
       <w:pPr>
-        <w:pStyle w:val="ListBullet"/>
-        <w:spacing w:before="20" w:after="20"/>
-        <w:ind w:left="576" w:hanging="288"/>
-      </w:pPr>
-      <w:r>
-        <w:rPr>
-          <w:color w:val="44403C"/>
-          <w:sz w:val="19"/>
-        </w:rPr>
-        <w:t>Built operational analytics products identifying an average 11.7% annual churn rate, enabling leadership to prioritize retention initiatives through predictive insights.</w:t>
-      </w:r>
-    </w:p>
-    <w:p>
-      <w:pPr>
-        <w:pStyle w:val="ListBullet"/>
-        <w:spacing w:before="20" w:after="20"/>
-        <w:ind w:left="576" w:hanging="288"/>
-      </w:pPr>
-      <w:r>
-        <w:rPr>
-          <w:color w:val="44403C"/>
-          <w:sz w:val="19"/>
-        </w:rPr>
-        <w:t>Developed an RFM segmentation model driving targeted engagement campaigns that retained 78% of high-risk customers.</w:t>
-      </w:r>
-    </w:p>
-    <w:p>
-      <w:pPr>
-        <w:spacing w:before="100" w:after="20"/>
+        <w:keepNext/>
+        <w:spacing w:before="60"/>
       </w:pPr>
       <w:r>
         <w:rPr>
           <w:b/>
           <w:color w:val="1C1917"/>
-          <w:sz w:val="20"/>
+          <w:sz w:val="21"/>
         </w:rPr>
         <w:t>Strategy Consultant  |  180 Degrees Consulting — University of British Columbia</w:t>
       </w:r>
@@ -574,42 +586,32 @@
     <w:p>
       <w:pPr>
         <w:pStyle w:val="ListBullet"/>
-        <w:spacing w:before="20" w:after="20"/>
-        <w:ind w:left="576" w:hanging="288"/>
+        <w:ind w:left="288" w:hanging="202"/>
+        <w:rPr>
+          <w:sz w:val="18"/>
+          <w:szCs w:val="18"/>
+        </w:rPr>
       </w:pPr>
       <w:r>
         <w:rPr>
-          <w:color w:val="44403C"/>
-          <w:sz w:val="19"/>
+          <w:sz w:val="18"/>
+          <w:szCs w:val="18"/>
         </w:rPr>
-        <w:t>Developed product and market strategies for nonprofit and clean energy organizations through customer research, market analysis, and strategic planning.</w:t>
+        <w:t>Designed a consumer conversion journey for Open Primaries that cut bounce rate 37% and doubled subscriptions.</w:t>
       </w:r>
     </w:p>
     <w:p>
       <w:pPr>
-        <w:pStyle w:val="ListBullet"/>
-        <w:spacing w:before="20" w:after="20"/>
-        <w:ind w:left="576" w:hanging="288"/>
-      </w:pPr>
-      <w:r>
-        <w:rPr>
-          <w:color w:val="44403C"/>
-          <w:sz w:val="19"/>
-        </w:rPr>
-        <w:t>Designed a data-driven acquisition strategy for Open Primaries that reduced website bounce rate by 37% while doubling subscriptions.</w:t>
-      </w:r>
-    </w:p>
-    <w:p>
-      <w:pPr>
-        <w:spacing w:before="100" w:after="20"/>
+        <w:keepNext/>
+        <w:spacing w:before="60"/>
       </w:pPr>
       <w:r>
         <w:rPr>
           <w:b/>
           <w:color w:val="1C1917"/>
-          <w:sz w:val="20"/>
+          <w:sz w:val="21"/>
         </w:rPr>
-        <w:t>SEO Consultant  |  Convertus</w:t>
+        <w:t>SEO Consultant — Consumer Growth  |  Convertus</w:t>
       </w:r>
       <w:r>
         <w:rPr>
@@ -622,42 +624,33 @@
     <w:p>
       <w:pPr>
         <w:pStyle w:val="ListBullet"/>
-        <w:spacing w:before="20" w:after="20"/>
-        <w:ind w:left="576" w:hanging="288"/>
+        <w:ind w:left="288" w:hanging="202"/>
+        <w:rPr>
+          <w:sz w:val="18"/>
+          <w:szCs w:val="18"/>
+        </w:rPr>
       </w:pPr>
       <w:r>
         <w:rPr>
-          <w:color w:val="44403C"/>
-          <w:sz w:val="19"/>
+          <w:sz w:val="18"/>
+          <w:szCs w:val="18"/>
         </w:rPr>
-        <w:t>Built analytics-driven growth strategies for 75+ client websites, increasing organic performance by approximately 150%.</w:t>
+        <w:t>Built acquisition and analytics for 75+ consumer websites, increasing organic performance by about 150%.</w:t>
       </w:r>
     </w:p>
     <w:p>
       <w:pPr>
-        <w:pStyle w:val="ListBullet"/>
-        <w:spacing w:before="20" w:after="20"/>
-        <w:ind w:left="576" w:hanging="288"/>
-      </w:pPr>
-      <w:r>
-        <w:rPr>
-          <w:color w:val="44403C"/>
-          <w:sz w:val="19"/>
-        </w:rPr>
-        <w:t>Developed a forecasting tool predicting SEO performance with approximately 85% accuracy to improve marketing planning.</w:t>
-      </w:r>
-    </w:p>
-    <w:p>
-      <w:pPr>
+        <w:keepNext/>
         <w:pBdr>
           <w:bottom w:val="single" w:sz="6" w:space="1" w:color="6D28D9"/>
         </w:pBdr>
-        <w:spacing w:before="40" w:after="40"/>
+        <w:spacing w:before="20" w:after="20"/>
       </w:pPr>
     </w:p>
     <w:p>
       <w:pPr>
-        <w:spacing w:before="160" w:after="40"/>
+        <w:keepNext/>
+        <w:spacing w:before="40"/>
       </w:pPr>
       <w:r>
         <w:rPr>
@@ -670,67 +663,48 @@
     </w:p>
     <w:p>
       <w:pPr>
-        <w:spacing w:before="100" w:after="20"/>
+        <w:keepNext/>
+        <w:spacing w:before="60"/>
       </w:pPr>
       <w:r>
         <w:rPr>
           <w:b/>
           <w:color w:val="1C1917"/>
-          <w:sz w:val="20"/>
+          <w:sz w:val="21"/>
         </w:rPr>
         <w:t>Master of Business Analytics  |  University of British Columbia</w:t>
       </w:r>
+    </w:p>
+    <w:p>
       <w:r>
         <w:rPr>
           <w:color w:val="78716C"/>
           <w:sz w:val="18"/>
         </w:rPr>
-        <w:t xml:space="preserve">    </w:t>
+        <w:t>Customer lifetime value  •  Gains charts  •  Python  •  SQL  •  R</w:t>
       </w:r>
     </w:p>
     <w:p>
       <w:pPr>
-        <w:spacing w:before="40" w:after="40"/>
-      </w:pPr>
-      <w:r>
-        <w:rPr>
-          <w:color w:val="78716C"/>
-          <w:sz w:val="18"/>
-        </w:rPr>
-        <w:t>Python  •  SQL  •  Machine Learning  •  Optimization  •  Product Analytics</w:t>
-      </w:r>
-    </w:p>
-    <w:p>
-      <w:pPr>
-        <w:spacing w:before="100" w:after="20"/>
+        <w:keepNext/>
+        <w:spacing w:before="60"/>
       </w:pPr>
       <w:r>
         <w:rPr>
           <w:b/>
           <w:color w:val="1C1917"/>
-          <w:sz w:val="20"/>
+          <w:sz w:val="21"/>
         </w:rPr>
         <w:t>Bachelor of Business Administration (Marketing)  |  British Columbia Institute of Technology</w:t>
       </w:r>
-      <w:r>
-        <w:rPr>
-          <w:color w:val="78716C"/>
-          <w:sz w:val="18"/>
-        </w:rPr>
-        <w:t xml:space="preserve">    </w:t>
-      </w:r>
     </w:p>
     <w:p>
       <w:pPr>
-        <w:pBdr>
-          <w:bottom w:val="single" w:sz="6" w:space="1" w:color="6D28D9"/>
-        </w:pBdr>
-        <w:spacing w:before="40" w:after="40"/>
-      </w:pPr>
-    </w:p>
-    <w:p>
-      <w:pPr>
-        <w:spacing w:before="160" w:after="40"/>
+        <w:keepNext/>
+        <w:spacing w:before="40"/>
+        <w:rPr>
+          <w:color w:val="6D28D9"/>
+        </w:rPr>
       </w:pPr>
       <w:r>
         <w:rPr>
@@ -747,62 +721,24 @@
       </w:pPr>
       <w:r>
         <w:rPr>
-          <w:b/>
-          <w:color w:val="1C1917"/>
-          <w:sz w:val="19"/>
+          <w:sz w:val="18"/>
         </w:rPr>
-        <w:t>Speaker — ProductCamp BC (2025)</w:t>
+        <w:t>Speaker, ProductCamp BC (2025). Mentor, ProductBC — product discovery, strategy, and career development.</w:t>
       </w:r>
     </w:p>
     <w:p>
       <w:pPr>
-        <w:spacing w:after="40"/>
-      </w:pPr>
-      <w:r>
-        <w:rPr>
-          <w:i/>
-          <w:color w:val="44403C"/>
-          <w:sz w:val="19"/>
-        </w:rPr>
-        <w:t>"How Legacy Industries Can Adopt a Product Mindset to Improve Service Delivery."</w:t>
-      </w:r>
-    </w:p>
-    <w:p>
-      <w:pPr>
-        <w:spacing w:before="80" w:after="20"/>
-      </w:pPr>
-      <w:r>
-        <w:rPr>
-          <w:b/>
-          <w:color w:val="1C1917"/>
-          <w:sz w:val="19"/>
-        </w:rPr>
-        <w:t>Mentor — ProductBC</w:t>
-      </w:r>
-    </w:p>
-    <w:p>
-      <w:pPr>
-        <w:spacing w:after="40"/>
-      </w:pPr>
-      <w:r>
-        <w:rPr>
-          <w:color w:val="44403C"/>
-          <w:sz w:val="19"/>
-        </w:rPr>
-        <w:t>Mentor aspiring Product Managers in product discovery, strategy, and career development.</w:t>
-      </w:r>
-    </w:p>
-    <w:p>
-      <w:pPr>
+        <w:keepNext/>
         <w:pBdr>
           <w:bottom w:val="single" w:sz="6" w:space="1" w:color="6D28D9"/>
         </w:pBdr>
-        <w:spacing w:before="40" w:after="40"/>
+        <w:spacing w:before="20" w:after="20"/>
       </w:pPr>
     </w:p>
     <w:p>
       <w:pPr>
-        <w:spacing w:before="160" w:after="40"/>
+        <w:keepNext/>
+        <w:spacing w:before="40"/>
       </w:pPr>
       <w:r>
         <w:rPr>
@@ -815,107 +751,155 @@
     </w:p>
     <w:p>
       <w:pPr>
-        <w:spacing w:before="40" w:after="40"/>
+        <w:rPr>
+          <w:sz w:val="18"/>
+          <w:szCs w:val="18"/>
+          <w:lang w:val="en-CA"/>
+        </w:rPr>
       </w:pPr>
       <w:r>
         <w:rPr>
-          <w:b/>
-          <w:color w:val="5B21B6"/>
+          <w:color w:val="6D28D9"/>
           <w:sz w:val="18"/>
+          <w:szCs w:val="18"/>
+          <w:lang w:val="en-CA"/>
         </w:rPr>
-        <w:t xml:space="preserve">Product:  </w:t>
+        <w:t xml:space="preserve">Product Management: </w:t>
       </w:r>
       <w:r>
         <w:rPr>
-          <w:color w:val="44403C"/>
           <w:sz w:val="18"/>
+          <w:szCs w:val="18"/>
+          <w:lang w:val="en-CA"/>
         </w:rPr>
-        <w:t>Product Strategy  •  Product Discovery  •  Clinical Workflow Infrastructure  •  Care Delivery Systems  •  Internal Tools  •  Product Roadmaps  •  Workflow Automation  •  Platform Products  •  Product Analytics  •  Inbox Automation</w:t>
+        <w:t>Product Strategy, Roadmaps, Product Discovery, Prioritization, Cross-Functional Leadership, Stakeholder Alignment</w:t>
       </w:r>
     </w:p>
     <w:p>
       <w:pPr>
-        <w:spacing w:before="40" w:after="40"/>
+        <w:rPr>
+          <w:sz w:val="18"/>
+          <w:szCs w:val="18"/>
+          <w:lang w:val="en-CA"/>
+        </w:rPr>
       </w:pPr>
       <w:r>
         <w:rPr>
-          <w:b/>
-          <w:color w:val="5B21B6"/>
+          <w:color w:val="6D28D9"/>
           <w:sz w:val="18"/>
+          <w:szCs w:val="18"/>
+          <w:lang w:val="en-CA"/>
         </w:rPr>
-        <w:t xml:space="preserve">Healthcare:  </w:t>
+        <w:t xml:space="preserve">Patient &amp; User Experience: </w:t>
       </w:r>
       <w:r>
         <w:rPr>
-          <w:color w:val="44403C"/>
           <w:sz w:val="18"/>
+          <w:szCs w:val="18"/>
+          <w:lang w:val="en-CA"/>
         </w:rPr>
-        <w:t>Clinician Experience  •  EHR Systems  •  Provider Experience  •  Healthcare Operations  •  Interoperability  •  Clinical Documentation  •  Telehealth  •  HIPAA  •  Clinical Systems</w:t>
+        <w:t>User Journey Mapping, Onboarding, Follow-Up Workflows, Usability Testing, User Research, Adoption Optimization, Trust and Friction Reduction</w:t>
       </w:r>
     </w:p>
     <w:p>
       <w:pPr>
-        <w:spacing w:before="40" w:after="40"/>
+        <w:rPr>
+          <w:sz w:val="18"/>
+          <w:szCs w:val="18"/>
+          <w:lang w:val="en-CA"/>
+        </w:rPr>
       </w:pPr>
       <w:r>
         <w:rPr>
-          <w:b/>
-          <w:color w:val="5B21B6"/>
+          <w:color w:val="6D28D9"/>
           <w:sz w:val="18"/>
+          <w:szCs w:val="18"/>
+          <w:lang w:val="en-CA"/>
         </w:rPr>
-        <w:t xml:space="preserve">Technical:  </w:t>
+        <w:t xml:space="preserve">Growth &amp; Analytics: </w:t>
       </w:r>
       <w:r>
         <w:rPr>
-          <w:color w:val="44403C"/>
           <w:sz w:val="18"/>
+          <w:szCs w:val="18"/>
+          <w:lang w:val="en-CA"/>
         </w:rPr>
-        <w:t>REST APIs  •  EMR/EHR Integrations  •  CIAM/IAM  •  Platform Integrations  •  SQL  •  Python  •  Azure  •  Angular  •  .NET  •  PostHog  •  GitHub Copilot  •  Lovable</w:t>
+        <w:t xml:space="preserve">Funnel Analysis, Cohort Analysis, Churn Analysis, Customer Segmentation, RFM, Lifetime Value, Reactivation, Conversion Optimization, </w:t>
+      </w:r>
+      <w:proofErr w:type="spellStart"/>
+      <w:r>
+        <w:rPr>
+          <w:sz w:val="18"/>
+          <w:szCs w:val="18"/>
+          <w:lang w:val="en-CA"/>
+        </w:rPr>
+        <w:t>PostHog</w:t>
+      </w:r>
+      <w:proofErr w:type="spellEnd"/>
+      <w:r>
+        <w:rPr>
+          <w:sz w:val="18"/>
+          <w:szCs w:val="18"/>
+          <w:lang w:val="en-CA"/>
+        </w:rPr>
+        <w:t>, Product Metrics</w:t>
       </w:r>
     </w:p>
     <w:p>
       <w:pPr>
-        <w:spacing w:before="40" w:after="40"/>
+        <w:rPr>
+          <w:sz w:val="18"/>
+          <w:szCs w:val="18"/>
+          <w:lang w:val="en-CA"/>
+        </w:rPr>
       </w:pPr>
       <w:r>
         <w:rPr>
-          <w:b/>
-          <w:color w:val="5B21B6"/>
+          <w:color w:val="6D28D9"/>
           <w:sz w:val="18"/>
+          <w:szCs w:val="18"/>
+          <w:lang w:val="en-CA"/>
         </w:rPr>
-        <w:t xml:space="preserve">Research:  </w:t>
+        <w:t xml:space="preserve">Experimentation: </w:t>
       </w:r>
       <w:r>
         <w:rPr>
-          <w:color w:val="44403C"/>
           <w:sz w:val="18"/>
+          <w:szCs w:val="18"/>
+          <w:lang w:val="en-CA"/>
         </w:rPr>
-        <w:t>Journey Mapping  •  User Interviews  •  Workflow Analysis  •  Usability Testing  •  A/B Testing  •  Prototyping  •  Figma</w:t>
+        <w:t xml:space="preserve">Hypothesis-Driven Development, Staged Rollouts, Comparative Testing, A/B Testing </w:t>
       </w:r>
     </w:p>
     <w:p>
       <w:pPr>
-        <w:spacing w:before="40" w:after="40"/>
+        <w:rPr>
+          <w:sz w:val="18"/>
+          <w:szCs w:val="18"/>
+          <w:lang w:val="en-CA"/>
+        </w:rPr>
       </w:pPr>
       <w:r>
         <w:rPr>
-          <w:b/>
-          <w:color w:val="5B21B6"/>
+          <w:color w:val="6D28D9"/>
           <w:sz w:val="18"/>
+          <w:szCs w:val="18"/>
+          <w:lang w:val="en-CA"/>
         </w:rPr>
-        <w:t xml:space="preserve">AI:  </w:t>
+        <w:t xml:space="preserve">Healthcare &amp; Technology: </w:t>
       </w:r>
       <w:r>
         <w:rPr>
-          <w:color w:val="44403C"/>
           <w:sz w:val="18"/>
+          <w:szCs w:val="18"/>
+          <w:lang w:val="en-CA"/>
         </w:rPr>
-        <w:t>Generative AI  •  LLM Applications  •  NLP  •  AI-assisted Product Development  •  Intelligent Task Routing</w:t>
+        <w:t>Healthcare Operations, Clinician Experience, Clinical Workflows, Telehealth, EHR/EMR Integrations, REST APIs, SQL, Python, AI-Enabled Products</w:t>
       </w:r>
     </w:p>
     <w:sectPr>
       <w:pgSz w:w="12240" w:h="15840"/>
-      <w:pgMar w:top="850" w:right="1020" w:bottom="850" w:left="1020" w:header="720" w:footer="720" w:gutter="0"/>
+      <w:pgMar w:top="567" w:right="850" w:bottom="482" w:left="850" w:header="720" w:footer="720" w:gutter="0"/>
       <w:cols w:space="720"/>
       <w:docGrid w:linePitch="360"/>
     </w:sectPr>
@@ -1096,32 +1080,336 @@
       </w:rPr>
     </w:lvl>
   </w:abstractNum>
-  <w:num w:numId="1" w16cid:durableId="690033398">
+  <w:abstractNum w:abstractNumId="9" w15:restartNumberingAfterBreak="0">
+    <w:nsid w:val="345318B5"/>
+    <w:multiLevelType w:val="multilevel"/>
+    <w:tmpl w:val="1C3ED778"/>
+    <w:lvl w:ilvl="0">
+      <w:start w:val="1"/>
+      <w:numFmt w:val="bullet"/>
+      <w:lvlText w:val=""/>
+      <w:lvlJc w:val="left"/>
+      <w:pPr>
+        <w:tabs>
+          <w:tab w:val="num" w:pos="720"/>
+        </w:tabs>
+        <w:ind w:left="720" w:hanging="360"/>
+      </w:pPr>
+      <w:rPr>
+        <w:rFonts w:ascii="Symbol" w:hAnsi="Symbol" w:hint="default"/>
+        <w:sz w:val="20"/>
+      </w:rPr>
+    </w:lvl>
+    <w:lvl w:ilvl="1" w:tentative="1">
+      <w:start w:val="1"/>
+      <w:numFmt w:val="bullet"/>
+      <w:lvlText w:val="o"/>
+      <w:lvlJc w:val="left"/>
+      <w:pPr>
+        <w:tabs>
+          <w:tab w:val="num" w:pos="1440"/>
+        </w:tabs>
+        <w:ind w:left="1440" w:hanging="360"/>
+      </w:pPr>
+      <w:rPr>
+        <w:rFonts w:ascii="Courier New" w:hAnsi="Courier New" w:hint="default"/>
+        <w:sz w:val="20"/>
+      </w:rPr>
+    </w:lvl>
+    <w:lvl w:ilvl="2" w:tentative="1">
+      <w:start w:val="1"/>
+      <w:numFmt w:val="bullet"/>
+      <w:lvlText w:val=""/>
+      <w:lvlJc w:val="left"/>
+      <w:pPr>
+        <w:tabs>
+          <w:tab w:val="num" w:pos="2160"/>
+        </w:tabs>
+        <w:ind w:left="2160" w:hanging="360"/>
+      </w:pPr>
+      <w:rPr>
+        <w:rFonts w:ascii="Wingdings" w:hAnsi="Wingdings" w:hint="default"/>
+        <w:sz w:val="20"/>
+      </w:rPr>
+    </w:lvl>
+    <w:lvl w:ilvl="3" w:tentative="1">
+      <w:start w:val="1"/>
+      <w:numFmt w:val="bullet"/>
+      <w:lvlText w:val=""/>
+      <w:lvlJc w:val="left"/>
+      <w:pPr>
+        <w:tabs>
+          <w:tab w:val="num" w:pos="2880"/>
+        </w:tabs>
+        <w:ind w:left="2880" w:hanging="360"/>
+      </w:pPr>
+      <w:rPr>
+        <w:rFonts w:ascii="Wingdings" w:hAnsi="Wingdings" w:hint="default"/>
+        <w:sz w:val="20"/>
+      </w:rPr>
+    </w:lvl>
+    <w:lvl w:ilvl="4" w:tentative="1">
+      <w:start w:val="1"/>
+      <w:numFmt w:val="bullet"/>
+      <w:lvlText w:val=""/>
+      <w:lvlJc w:val="left"/>
+      <w:pPr>
+        <w:tabs>
+          <w:tab w:val="num" w:pos="3600"/>
+        </w:tabs>
+        <w:ind w:left="3600" w:hanging="360"/>
+      </w:pPr>
+      <w:rPr>
+        <w:rFonts w:ascii="Wingdings" w:hAnsi="Wingdings" w:hint="default"/>
+        <w:sz w:val="20"/>
+      </w:rPr>
+    </w:lvl>
+    <w:lvl w:ilvl="5" w:tentative="1">
+      <w:start w:val="1"/>
+      <w:numFmt w:val="bullet"/>
+      <w:lvlText w:val=""/>
+      <w:lvlJc w:val="left"/>
+      <w:pPr>
+        <w:tabs>
+          <w:tab w:val="num" w:pos="4320"/>
+        </w:tabs>
+        <w:ind w:left="4320" w:hanging="360"/>
+      </w:pPr>
+      <w:rPr>
+        <w:rFonts w:ascii="Wingdings" w:hAnsi="Wingdings" w:hint="default"/>
+        <w:sz w:val="20"/>
+      </w:rPr>
+    </w:lvl>
+    <w:lvl w:ilvl="6" w:tentative="1">
+      <w:start w:val="1"/>
+      <w:numFmt w:val="bullet"/>
+      <w:lvlText w:val=""/>
+      <w:lvlJc w:val="left"/>
+      <w:pPr>
+        <w:tabs>
+          <w:tab w:val="num" w:pos="5040"/>
+        </w:tabs>
+        <w:ind w:left="5040" w:hanging="360"/>
+      </w:pPr>
+      <w:rPr>
+        <w:rFonts w:ascii="Wingdings" w:hAnsi="Wingdings" w:hint="default"/>
+        <w:sz w:val="20"/>
+      </w:rPr>
+    </w:lvl>
+    <w:lvl w:ilvl="7" w:tentative="1">
+      <w:start w:val="1"/>
+      <w:numFmt w:val="bullet"/>
+      <w:lvlText w:val=""/>
+      <w:lvlJc w:val="left"/>
+      <w:pPr>
+        <w:tabs>
+          <w:tab w:val="num" w:pos="5760"/>
+        </w:tabs>
+        <w:ind w:left="5760" w:hanging="360"/>
+      </w:pPr>
+      <w:rPr>
+        <w:rFonts w:ascii="Wingdings" w:hAnsi="Wingdings" w:hint="default"/>
+        <w:sz w:val="20"/>
+      </w:rPr>
+    </w:lvl>
+    <w:lvl w:ilvl="8" w:tentative="1">
+      <w:start w:val="1"/>
+      <w:numFmt w:val="bullet"/>
+      <w:lvlText w:val=""/>
+      <w:lvlJc w:val="left"/>
+      <w:pPr>
+        <w:tabs>
+          <w:tab w:val="num" w:pos="6480"/>
+        </w:tabs>
+        <w:ind w:left="6480" w:hanging="360"/>
+      </w:pPr>
+      <w:rPr>
+        <w:rFonts w:ascii="Wingdings" w:hAnsi="Wingdings" w:hint="default"/>
+        <w:sz w:val="20"/>
+      </w:rPr>
+    </w:lvl>
+  </w:abstractNum>
+  <w:abstractNum w:abstractNumId="10" w15:restartNumberingAfterBreak="0">
+    <w:nsid w:val="6B921C5E"/>
+    <w:multiLevelType w:val="multilevel"/>
+    <w:tmpl w:val="0D84CB12"/>
+    <w:lvl w:ilvl="0">
+      <w:start w:val="1"/>
+      <w:numFmt w:val="bullet"/>
+      <w:lvlText w:val=""/>
+      <w:lvlJc w:val="left"/>
+      <w:pPr>
+        <w:tabs>
+          <w:tab w:val="num" w:pos="720"/>
+        </w:tabs>
+        <w:ind w:left="720" w:hanging="360"/>
+      </w:pPr>
+      <w:rPr>
+        <w:rFonts w:ascii="Symbol" w:hAnsi="Symbol" w:hint="default"/>
+        <w:sz w:val="20"/>
+      </w:rPr>
+    </w:lvl>
+    <w:lvl w:ilvl="1" w:tentative="1">
+      <w:start w:val="1"/>
+      <w:numFmt w:val="bullet"/>
+      <w:lvlText w:val="o"/>
+      <w:lvlJc w:val="left"/>
+      <w:pPr>
+        <w:tabs>
+          <w:tab w:val="num" w:pos="1440"/>
+        </w:tabs>
+        <w:ind w:left="1440" w:hanging="360"/>
+      </w:pPr>
+      <w:rPr>
+        <w:rFonts w:ascii="Courier New" w:hAnsi="Courier New" w:hint="default"/>
+        <w:sz w:val="20"/>
+      </w:rPr>
+    </w:lvl>
+    <w:lvl w:ilvl="2" w:tentative="1">
+      <w:start w:val="1"/>
+      <w:numFmt w:val="bullet"/>
+      <w:lvlText w:val=""/>
+      <w:lvlJc w:val="left"/>
+      <w:pPr>
+        <w:tabs>
+          <w:tab w:val="num" w:pos="2160"/>
+        </w:tabs>
+        <w:ind w:left="2160" w:hanging="360"/>
+      </w:pPr>
+      <w:rPr>
+        <w:rFonts w:ascii="Wingdings" w:hAnsi="Wingdings" w:hint="default"/>
+        <w:sz w:val="20"/>
+      </w:rPr>
+    </w:lvl>
+    <w:lvl w:ilvl="3" w:tentative="1">
+      <w:start w:val="1"/>
+      <w:numFmt w:val="bullet"/>
+      <w:lvlText w:val=""/>
+      <w:lvlJc w:val="left"/>
+      <w:pPr>
+        <w:tabs>
+          <w:tab w:val="num" w:pos="2880"/>
+        </w:tabs>
+        <w:ind w:left="2880" w:hanging="360"/>
+      </w:pPr>
+      <w:rPr>
+        <w:rFonts w:ascii="Wingdings" w:hAnsi="Wingdings" w:hint="default"/>
+        <w:sz w:val="20"/>
+      </w:rPr>
+    </w:lvl>
+    <w:lvl w:ilvl="4" w:tentative="1">
+      <w:start w:val="1"/>
+      <w:numFmt w:val="bullet"/>
+      <w:lvlText w:val=""/>
+      <w:lvlJc w:val="left"/>
+      <w:pPr>
+        <w:tabs>
+          <w:tab w:val="num" w:pos="3600"/>
+        </w:tabs>
+        <w:ind w:left="3600" w:hanging="360"/>
+      </w:pPr>
+      <w:rPr>
+        <w:rFonts w:ascii="Wingdings" w:hAnsi="Wingdings" w:hint="default"/>
+        <w:sz w:val="20"/>
+      </w:rPr>
+    </w:lvl>
+    <w:lvl w:ilvl="5" w:tentative="1">
+      <w:start w:val="1"/>
+      <w:numFmt w:val="bullet"/>
+      <w:lvlText w:val=""/>
+      <w:lvlJc w:val="left"/>
+      <w:pPr>
+        <w:tabs>
+          <w:tab w:val="num" w:pos="4320"/>
+        </w:tabs>
+        <w:ind w:left="4320" w:hanging="360"/>
+      </w:pPr>
+      <w:rPr>
+        <w:rFonts w:ascii="Wingdings" w:hAnsi="Wingdings" w:hint="default"/>
+        <w:sz w:val="20"/>
+      </w:rPr>
+    </w:lvl>
+    <w:lvl w:ilvl="6" w:tentative="1">
+      <w:start w:val="1"/>
+      <w:numFmt w:val="bullet"/>
+      <w:lvlText w:val=""/>
+      <w:lvlJc w:val="left"/>
+      <w:pPr>
+        <w:tabs>
+          <w:tab w:val="num" w:pos="5040"/>
+        </w:tabs>
+        <w:ind w:left="5040" w:hanging="360"/>
+      </w:pPr>
+      <w:rPr>
+        <w:rFonts w:ascii="Wingdings" w:hAnsi="Wingdings" w:hint="default"/>
+        <w:sz w:val="20"/>
+      </w:rPr>
+    </w:lvl>
+    <w:lvl w:ilvl="7" w:tentative="1">
+      <w:start w:val="1"/>
+      <w:numFmt w:val="bullet"/>
+      <w:lvlText w:val=""/>
+      <w:lvlJc w:val="left"/>
+      <w:pPr>
+        <w:tabs>
+          <w:tab w:val="num" w:pos="5760"/>
+        </w:tabs>
+        <w:ind w:left="5760" w:hanging="360"/>
+      </w:pPr>
+      <w:rPr>
+        <w:rFonts w:ascii="Wingdings" w:hAnsi="Wingdings" w:hint="default"/>
+        <w:sz w:val="20"/>
+      </w:rPr>
+    </w:lvl>
+    <w:lvl w:ilvl="8" w:tentative="1">
+      <w:start w:val="1"/>
+      <w:numFmt w:val="bullet"/>
+      <w:lvlText w:val=""/>
+      <w:lvlJc w:val="left"/>
+      <w:pPr>
+        <w:tabs>
+          <w:tab w:val="num" w:pos="6480"/>
+        </w:tabs>
+        <w:ind w:left="6480" w:hanging="360"/>
+      </w:pPr>
+      <w:rPr>
+        <w:rFonts w:ascii="Wingdings" w:hAnsi="Wingdings" w:hint="default"/>
+        <w:sz w:val="20"/>
+      </w:rPr>
+    </w:lvl>
+  </w:abstractNum>
+  <w:num w:numId="1" w16cid:durableId="278032443">
     <w:abstractNumId w:val="8"/>
   </w:num>
-  <w:num w:numId="2" w16cid:durableId="1617910947">
+  <w:num w:numId="2" w16cid:durableId="144320024">
     <w:abstractNumId w:val="6"/>
   </w:num>
-  <w:num w:numId="3" w16cid:durableId="911428885">
+  <w:num w:numId="3" w16cid:durableId="1148278551">
     <w:abstractNumId w:val="5"/>
   </w:num>
-  <w:num w:numId="4" w16cid:durableId="1468744637">
+  <w:num w:numId="4" w16cid:durableId="509834303">
     <w:abstractNumId w:val="4"/>
   </w:num>
-  <w:num w:numId="5" w16cid:durableId="379935517">
+  <w:num w:numId="5" w16cid:durableId="482158434">
     <w:abstractNumId w:val="7"/>
   </w:num>
-  <w:num w:numId="6" w16cid:durableId="1656954755">
+  <w:num w:numId="6" w16cid:durableId="1625383335">
     <w:abstractNumId w:val="3"/>
   </w:num>
-  <w:num w:numId="7" w16cid:durableId="959722789">
+  <w:num w:numId="7" w16cid:durableId="1683240527">
     <w:abstractNumId w:val="2"/>
   </w:num>
-  <w:num w:numId="8" w16cid:durableId="2112705143">
+  <w:num w:numId="8" w16cid:durableId="130563942">
     <w:abstractNumId w:val="1"/>
   </w:num>
-  <w:num w:numId="9" w16cid:durableId="855998382">
+  <w:num w:numId="9" w16cid:durableId="367146384">
     <w:abstractNumId w:val="0"/>
+  </w:num>
+  <w:num w:numId="10" w16cid:durableId="1778400539">
+    <w:abstractNumId w:val="9"/>
+  </w:num>
+  <w:num w:numId="11" w16cid:durableId="1920018502">
+    <w:abstractNumId w:val="10"/>
   </w:num>
 </w:numbering>
 </file>
@@ -1516,6 +1804,14 @@
     <w:name w:val="Normal"/>
     <w:qFormat/>
     <w:rsid w:val="00FC693F"/>
+    <w:pPr>
+      <w:spacing w:after="0" w:line="240" w:lineRule="auto"/>
+    </w:pPr>
+    <w:rPr>
+      <w:rFonts w:ascii="Calibri" w:hAnsi="Calibri" w:cs="Calibri"/>
+      <w:color w:val="44403C"/>
+      <w:sz w:val="19"/>
+    </w:rPr>
   </w:style>
   <w:style w:type="paragraph" w:styleId="Heading1">
     <w:name w:val="heading 1"/>
@@ -1528,7 +1824,7 @@
     <w:pPr>
       <w:keepNext/>
       <w:keepLines/>
-      <w:spacing w:before="480" w:after="0"/>
+      <w:spacing w:before="480"/>
       <w:outlineLvl w:val="0"/>
     </w:pPr>
     <w:rPr>
@@ -1552,7 +1848,7 @@
     <w:pPr>
       <w:keepNext/>
       <w:keepLines/>
-      <w:spacing w:before="200" w:after="0"/>
+      <w:spacing w:before="200"/>
       <w:outlineLvl w:val="1"/>
     </w:pPr>
     <w:rPr>
@@ -1576,7 +1872,7 @@
     <w:pPr>
       <w:keepNext/>
       <w:keepLines/>
-      <w:spacing w:before="200" w:after="0"/>
+      <w:spacing w:before="200"/>
       <w:outlineLvl w:val="2"/>
     </w:pPr>
     <w:rPr>
@@ -1599,7 +1895,7 @@
     <w:pPr>
       <w:keepNext/>
       <w:keepLines/>
-      <w:spacing w:before="200" w:after="0"/>
+      <w:spacing w:before="200"/>
       <w:outlineLvl w:val="3"/>
     </w:pPr>
     <w:rPr>
@@ -1624,7 +1920,7 @@
     <w:pPr>
       <w:keepNext/>
       <w:keepLines/>
-      <w:spacing w:before="200" w:after="0"/>
+      <w:spacing w:before="200"/>
       <w:outlineLvl w:val="4"/>
     </w:pPr>
     <w:rPr>
@@ -1645,7 +1941,7 @@
     <w:pPr>
       <w:keepNext/>
       <w:keepLines/>
-      <w:spacing w:before="200" w:after="0"/>
+      <w:spacing w:before="200"/>
       <w:outlineLvl w:val="5"/>
     </w:pPr>
     <w:rPr>
@@ -1668,7 +1964,7 @@
     <w:pPr>
       <w:keepNext/>
       <w:keepLines/>
-      <w:spacing w:before="200" w:after="0"/>
+      <w:spacing w:before="200"/>
       <w:outlineLvl w:val="6"/>
     </w:pPr>
     <w:rPr>
@@ -1691,7 +1987,7 @@
     <w:pPr>
       <w:keepNext/>
       <w:keepLines/>
-      <w:spacing w:before="200" w:after="0"/>
+      <w:spacing w:before="200"/>
       <w:outlineLvl w:val="7"/>
     </w:pPr>
     <w:rPr>
@@ -1714,7 +2010,7 @@
     <w:pPr>
       <w:keepNext/>
       <w:keepLines/>
-      <w:spacing w:before="200" w:after="0"/>
+      <w:spacing w:before="200"/>
       <w:outlineLvl w:val="8"/>
     </w:pPr>
     <w:rPr>
@@ -1764,7 +2060,6 @@
         <w:tab w:val="center" w:pos="4680"/>
         <w:tab w:val="right" w:pos="9360"/>
       </w:tabs>
-      <w:spacing w:after="0" w:line="240" w:lineRule="auto"/>
     </w:pPr>
   </w:style>
   <w:style w:type="character" w:customStyle="1" w:styleId="HeaderChar">
@@ -1786,7 +2081,6 @@
         <w:tab w:val="center" w:pos="4680"/>
         <w:tab w:val="right" w:pos="9360"/>
       </w:tabs>
-      <w:spacing w:after="0" w:line="240" w:lineRule="auto"/>
     </w:pPr>
   </w:style>
   <w:style w:type="character" w:customStyle="1" w:styleId="FooterChar">
@@ -1860,7 +2154,7 @@
       <w:pBdr>
         <w:bottom w:val="single" w:sz="8" w:space="4" w:color="4F81BD" w:themeColor="accent1"/>
       </w:pBdr>
-      <w:spacing w:after="300" w:line="240" w:lineRule="auto"/>
+      <w:spacing w:after="300"/>
       <w:contextualSpacing/>
     </w:pPr>
     <w:rPr>
@@ -2302,9 +2596,6 @@
     <w:unhideWhenUsed/>
     <w:qFormat/>
     <w:rsid w:val="00FC693F"/>
-    <w:pPr>
-      <w:spacing w:line="240" w:lineRule="auto"/>
-    </w:pPr>
     <w:rPr>
       <w:b/>
       <w:bCs/>
@@ -12504,29 +12795,6 @@
         <w:shd w:val="clear" w:color="auto" w:fill="FBCAA2" w:themeFill="accent6" w:themeFillTint="7F"/>
       </w:tcPr>
     </w:tblStylePr>
-  </w:style>
-  <w:style w:type="character" w:styleId="Hyperlink">
-    <w:name w:val="Hyperlink"/>
-    <w:basedOn w:val="DefaultParagraphFont"/>
-    <w:uiPriority w:val="99"/>
-    <w:unhideWhenUsed/>
-    <w:rsid w:val="00305EB9"/>
-    <w:rPr>
-      <w:color w:val="0000FF" w:themeColor="hyperlink"/>
-      <w:u w:val="single"/>
-    </w:rPr>
-  </w:style>
-  <w:style w:type="character" w:styleId="UnresolvedMention">
-    <w:name w:val="Unresolved Mention"/>
-    <w:basedOn w:val="DefaultParagraphFont"/>
-    <w:uiPriority w:val="99"/>
-    <w:semiHidden/>
-    <w:unhideWhenUsed/>
-    <w:rsid w:val="00305EB9"/>
-    <w:rPr>
-      <w:color w:val="605E5C"/>
-      <w:shd w:val="clear" w:color="auto" w:fill="E1DFDD"/>
-    </w:rPr>
   </w:style>
 </w:styles>
 </file>

</xml_diff>